<commit_message>
Correct the device-investigation claim in the deployment comparison
The comparison said device investigation was 'not available' with the Marketplace
option. That is wrong: its extension ships an Investigate Device playbook that builds a
host view from koi-inventory-list filtered by host plus Cortex XDR queries.

What is genuinely custom-only is KOI's own device record — last seen, registration,
logged-on user, status — which needs koi-devices-list, koi-device-inventory-get and
koi-groups-list. The row now reads full versus partial rather than yes versus no, and
the decision question asks whether analysts need KOI's device record specifically.

A customer choosing on this table deserves the real distinction, not a flattering one.

Co-Authored-By: Claude Fable 5 <noreply@anthropic.com>
</commit_message>
<xml_diff>
--- a/docs/KOI_Deployment_Comparison_v1.0.docx
+++ b/docs/KOI_Deployment_Comparison_v1.0.docx
@@ -851,7 +851,7 @@
                 <w:sz w:val="19"/>
                 <w:szCs w:val="19"/>
               </w:rPr>
-              <w:t xml:space="preserve">Yes</w:t>
+              <w:t xml:space="preserve">Full — KOI's own device records</w:t>
             </w:r>
           </w:p>
         </w:tc>
@@ -879,7 +879,7 @@
                 <w:sz w:val="19"/>
                 <w:szCs w:val="19"/>
               </w:rPr>
-              <w:t xml:space="preserve">Not available — no device commands</w:t>
+              <w:t xml:space="preserve">Partial — inferred from inventory and XDR data</w:t>
             </w:r>
           </w:p>
         </w:tc>
@@ -2348,7 +2348,7 @@
                 <w:sz w:val="19"/>
                 <w:szCs w:val="19"/>
               </w:rPr>
-              <w:t xml:space="preserve">Answer "what else is installed on this host, and how risky is any of it". Without these there is no device investigation at all.</w:t>
+              <w:t xml:space="preserve">Read KOI's own device record — last seen, registration, logged-on user, status — and everything KOI inventoried on that host. Option B can only infer a host view by filtering inventory and correlating XDR data.</w:t>
             </w:r>
           </w:p>
         </w:tc>
@@ -2946,7 +2946,7 @@
           <w:sz w:val="22"/>
           <w:szCs w:val="22"/>
         </w:rPr>
-        <w:t xml:space="preserve">Device investigation exists. An alert on a host expands into everything installed there and what is risky about it.</w:t>
+        <w:t xml:space="preserve">Device investigation is first-hand. An alert on a host expands into KOI's own device record and everything KOI inventoried there, rather than an inventory query filtered by host.</w:t>
       </w:r>
     </w:p>
     <w:p>
@@ -4561,7 +4561,7 @@
                 <w:sz w:val="19"/>
                 <w:szCs w:val="19"/>
               </w:rPr>
-              <w:t xml:space="preserve">Will analysts investigate the host, not just the item?</w:t>
+              <w:t xml:space="preserve">Do analysts need KOI's own device record, not just an inventory view?</w:t>
             </w:r>
           </w:p>
         </w:tc>
@@ -4589,7 +4589,7 @@
                 <w:sz w:val="19"/>
                 <w:szCs w:val="19"/>
               </w:rPr>
-              <w:t xml:space="preserve">Option A — device investigation needs the custom commands</w:t>
+              <w:t xml:space="preserve">Option A — the device commands are custom-only</w:t>
             </w:r>
           </w:p>
         </w:tc>

</xml_diff>